<commit_message>
Fix: rename Adam → Kelsey throughout (phone owner)
All is_from_me reactions were incorrectly labeled Adam.
Corrected to Kelsey across all 8 chapters and the DOCX download.

Co-Authored-By: Claude Sonnet 4.6 <noreply@anthropic.com>
</commit_message>
<xml_diff>
--- a/della-and-oban.docx
+++ b/della-and-oban.docx
@@ -250,7 +250,7 @@
           <w:sz w:val="20"/>
           <w:szCs w:val="20"/>
         </w:rPr>
-        <w:t xml:space="preserve">Adam: Wait hold up I don't even see the title! Is it awesome? It must be if you made it Byron! </w:t>
+        <w:t xml:space="preserve">Kelsey: Wait hold up I don't even see the title! Is it awesome? It must be if you made it Byron! </w:t>
       </w:r>
     </w:p>
     <w:p>
@@ -360,7 +360,7 @@
           <w:sz w:val="20"/>
           <w:szCs w:val="20"/>
         </w:rPr>
-        <w:t xml:space="preserve">Adam: 🤪💗💗</w:t>
+        <w:t xml:space="preserve">Kelsey: 🤪💗💗</w:t>
       </w:r>
     </w:p>
     <w:p>
@@ -425,7 +425,7 @@
           <w:sz w:val="20"/>
           <w:szCs w:val="20"/>
         </w:rPr>
-        <w:t xml:space="preserve">Adam: 🤣🤣🤣</w:t>
+        <w:t xml:space="preserve">Kelsey: 🤣🤣🤣</w:t>
       </w:r>
     </w:p>
     <w:p>
@@ -510,7 +510,7 @@
           <w:sz w:val="20"/>
           <w:szCs w:val="20"/>
         </w:rPr>
-        <w:t xml:space="preserve">Adam: AMAZING </w:t>
+        <w:t xml:space="preserve">Kelsey: AMAZING </w:t>
       </w:r>
     </w:p>
     <w:p>
@@ -616,7 +616,7 @@
           <w:sz w:val="20"/>
           <w:szCs w:val="20"/>
         </w:rPr>
-        <w:t xml:space="preserve">Adam: AMAZING </w:t>
+        <w:t xml:space="preserve">Kelsey: AMAZING </w:t>
       </w:r>
     </w:p>
     <w:p>
@@ -702,7 +702,7 @@
           <w:sz w:val="20"/>
           <w:szCs w:val="20"/>
         </w:rPr>
-        <w:t xml:space="preserve">Adam: AMAZING </w:t>
+        <w:t xml:space="preserve">Kelsey: AMAZING </w:t>
       </w:r>
     </w:p>
     <w:p>
@@ -932,7 +932,7 @@
           <w:sz w:val="20"/>
           <w:szCs w:val="20"/>
         </w:rPr>
-        <w:t xml:space="preserve">Adam: You are a poet Byron! </w:t>
+        <w:t xml:space="preserve">Kelsey: You are a poet Byron! </w:t>
       </w:r>
     </w:p>
     <w:p>
@@ -997,7 +997,7 @@
           <w:sz w:val="20"/>
           <w:szCs w:val="20"/>
         </w:rPr>
-        <w:t xml:space="preserve">Adam: A thousand cursed indeed! </w:t>
+        <w:t xml:space="preserve">Kelsey: A thousand cursed indeed! </w:t>
       </w:r>
     </w:p>
     <w:p>
@@ -1107,7 +1107,7 @@
           <w:sz w:val="20"/>
           <w:szCs w:val="20"/>
         </w:rPr>
-        <w:t xml:space="preserve">Adam: 😭🥰🥰</w:t>
+        <w:t xml:space="preserve">Kelsey: 😭🥰🥰</w:t>
       </w:r>
     </w:p>
     <w:p>
@@ -1212,7 +1212,7 @@
           <w:sz w:val="20"/>
           <w:szCs w:val="20"/>
         </w:rPr>
-        <w:t xml:space="preserve">Adam: 🤣🤣</w:t>
+        <w:t xml:space="preserve">Kelsey: 🤣🤣</w:t>
       </w:r>
     </w:p>
     <w:p>
@@ -1330,7 +1330,7 @@
           <w:sz w:val="20"/>
           <w:szCs w:val="20"/>
         </w:rPr>
-        <w:t xml:space="preserve">Adam: 😭☺️☺️</w:t>
+        <w:t xml:space="preserve">Kelsey: 😭☺️☺️</w:t>
       </w:r>
     </w:p>
     <w:p>
@@ -1408,7 +1408,7 @@
           <w:sz w:val="20"/>
           <w:szCs w:val="20"/>
         </w:rPr>
-        <w:t xml:space="preserve">Adam: 😭😜👏👏</w:t>
+        <w:t xml:space="preserve">Kelsey: 😭😜👏👏</w:t>
       </w:r>
     </w:p>
     <w:p>
@@ -1493,7 +1493,7 @@
           <w:sz w:val="20"/>
           <w:szCs w:val="20"/>
         </w:rPr>
-        <w:t xml:space="preserve">Adam: 😍😍</w:t>
+        <w:t xml:space="preserve">Kelsey: 😍😍</w:t>
       </w:r>
     </w:p>
     <w:p>
@@ -1618,7 +1618,7 @@
           <w:sz w:val="20"/>
           <w:szCs w:val="20"/>
         </w:rPr>
-        <w:t xml:space="preserve">Adam: 😂😂😂</w:t>
+        <w:t xml:space="preserve">Kelsey: 😂😂😂</w:t>
       </w:r>
     </w:p>
     <w:p>
@@ -2088,7 +2088,7 @@
           <w:sz w:val="20"/>
           <w:szCs w:val="20"/>
         </w:rPr>
-        <w:t xml:space="preserve">Adam: 😭😍😍</w:t>
+        <w:t xml:space="preserve">Kelsey: 😭😍😍</w:t>
       </w:r>
     </w:p>
     <w:p>
@@ -2488,7 +2488,7 @@
           <w:sz w:val="20"/>
           <w:szCs w:val="20"/>
         </w:rPr>
-        <w:t xml:space="preserve">Adam:  😂😂😂👏👏👏👏👏</w:t>
+        <w:t xml:space="preserve">Kelsey:  😂😂😂👏👏👏👏👏</w:t>
       </w:r>
     </w:p>
     <w:p>
@@ -2573,7 +2573,7 @@
           <w:sz w:val="20"/>
           <w:szCs w:val="20"/>
         </w:rPr>
-        <w:t xml:space="preserve">Adam:  😂😂😂👏👏👏👏👏</w:t>
+        <w:t xml:space="preserve">Kelsey:  😂😂😂👏👏👏👏👏</w:t>
       </w:r>
     </w:p>
     <w:p>
@@ -2793,7 +2793,7 @@
           <w:sz w:val="20"/>
           <w:szCs w:val="20"/>
         </w:rPr>
-        <w:t xml:space="preserve">Adam: This message is easily in the top 5 for me 👏👏👏</w:t>
+        <w:t xml:space="preserve">Kelsey: This message is easily in the top 5 for me 👏👏👏</w:t>
       </w:r>
     </w:p>
     <w:p>
@@ -2898,7 +2898,7 @@
           <w:sz w:val="20"/>
           <w:szCs w:val="20"/>
         </w:rPr>
-        <w:t xml:space="preserve">Adam: This message is easily in the top 5 for me 👏👏👏</w:t>
+        <w:t xml:space="preserve">Kelsey: This message is easily in the top 5 for me 👏👏👏</w:t>
       </w:r>
     </w:p>
     <w:p>
@@ -3023,7 +3023,7 @@
           <w:sz w:val="20"/>
           <w:szCs w:val="20"/>
         </w:rPr>
-        <w:t xml:space="preserve">Adam: 😂😂👏👏</w:t>
+        <w:t xml:space="preserve">Kelsey: 😂😂👏👏</w:t>
       </w:r>
     </w:p>
     <w:p>
@@ -3088,7 +3088,7 @@
           <w:sz w:val="20"/>
           <w:szCs w:val="20"/>
         </w:rPr>
-        <w:t xml:space="preserve">Adam: 😂😂👏👏</w:t>
+        <w:t xml:space="preserve">Kelsey: 😂😂👏👏</w:t>
       </w:r>
     </w:p>
     <w:p>
@@ -3166,7 +3166,7 @@
           <w:sz w:val="20"/>
           <w:szCs w:val="20"/>
         </w:rPr>
-        <w:t xml:space="preserve">Adam: Who knew I needed to be taking recipe advice from the pups👏</w:t>
+        <w:t xml:space="preserve">Kelsey: Who knew I needed to be taking recipe advice from the pups👏</w:t>
       </w:r>
     </w:p>
     <w:p>
@@ -3231,7 +3231,7 @@
           <w:sz w:val="20"/>
           <w:szCs w:val="20"/>
         </w:rPr>
-        <w:t xml:space="preserve">Adam: The audacity!! 
+        <w:t xml:space="preserve">Kelsey: The audacity!! 
 Such great photos 😍</w:t>
       </w:r>
     </w:p>
@@ -3539,7 +3539,7 @@
           <w:sz w:val="20"/>
           <w:szCs w:val="20"/>
         </w:rPr>
-        <w:t xml:space="preserve">Adam: 😂😍😍</w:t>
+        <w:t xml:space="preserve">Kelsey: 😂😍😍</w:t>
       </w:r>
     </w:p>
     <w:p>
@@ -3734,7 +3734,7 @@
           <w:sz w:val="20"/>
           <w:szCs w:val="20"/>
         </w:rPr>
-        <w:t xml:space="preserve">Adam:  🥰🥰</w:t>
+        <w:t xml:space="preserve">Kelsey:  🥰🥰</w:t>
       </w:r>
     </w:p>
     <w:p>
@@ -3844,7 +3844,7 @@
           <w:sz w:val="20"/>
           <w:szCs w:val="20"/>
         </w:rPr>
-        <w:t xml:space="preserve">Adam: 😍😍</w:t>
+        <w:t xml:space="preserve">Kelsey: 😍😍</w:t>
       </w:r>
     </w:p>
     <w:p>
@@ -3909,7 +3909,7 @@
           <w:sz w:val="20"/>
           <w:szCs w:val="20"/>
         </w:rPr>
-        <w:t xml:space="preserve">Adam: 😍😍</w:t>
+        <w:t xml:space="preserve">Kelsey: 😍😍</w:t>
       </w:r>
     </w:p>
     <w:p>
@@ -4014,7 +4014,7 @@
           <w:sz w:val="20"/>
           <w:szCs w:val="20"/>
         </w:rPr>
-        <w:t xml:space="preserve">Adam: 😂😂</w:t>
+        <w:t xml:space="preserve">Kelsey: 😂😂</w:t>
       </w:r>
     </w:p>
     <w:p>
@@ -4119,7 +4119,7 @@
           <w:sz w:val="20"/>
           <w:szCs w:val="20"/>
         </w:rPr>
-        <w:t xml:space="preserve">Adam: 😂😂</w:t>
+        <w:t xml:space="preserve">Kelsey: 😂😂</w:t>
       </w:r>
     </w:p>
     <w:p>
@@ -4224,7 +4224,7 @@
           <w:sz w:val="20"/>
           <w:szCs w:val="20"/>
         </w:rPr>
-        <w:t xml:space="preserve">Adam: 😂😂</w:t>
+        <w:t xml:space="preserve">Kelsey: 😂😂</w:t>
       </w:r>
     </w:p>
     <w:p>
@@ -4309,7 +4309,7 @@
           <w:sz w:val="20"/>
           <w:szCs w:val="20"/>
         </w:rPr>
-        <w:t xml:space="preserve">Adam: 💜💜</w:t>
+        <w:t xml:space="preserve">Kelsey: 💜💜</w:t>
       </w:r>
     </w:p>
     <w:p>
@@ -4374,7 +4374,7 @@
           <w:sz w:val="20"/>
           <w:szCs w:val="20"/>
         </w:rPr>
-        <w:t xml:space="preserve">Adam: 😂😂 I feel like we should be concerned </w:t>
+        <w:t xml:space="preserve">Kelsey: 😂😂 I feel like we should be concerned </w:t>
       </w:r>
     </w:p>
     <w:p>
@@ -4558,7 +4558,7 @@
           <w:sz w:val="20"/>
           <w:szCs w:val="20"/>
         </w:rPr>
-        <w:t xml:space="preserve">Adam: 🥰🥰</w:t>
+        <w:t xml:space="preserve">Kelsey: 🥰🥰</w:t>
       </w:r>
     </w:p>
     <w:p>
@@ -4709,7 +4709,7 @@
           <w:sz w:val="20"/>
           <w:szCs w:val="20"/>
         </w:rPr>
-        <w:t xml:space="preserve">Adam: 🍦🍦</w:t>
+        <w:t xml:space="preserve">Kelsey: 🍦🍦</w:t>
       </w:r>
     </w:p>
     <w:p>
@@ -4787,7 +4787,7 @@
           <w:sz w:val="20"/>
           <w:szCs w:val="20"/>
         </w:rPr>
-        <w:t xml:space="preserve">Adam: 😱😱</w:t>
+        <w:t xml:space="preserve">Kelsey: 😱😱</w:t>
       </w:r>
     </w:p>
     <w:p>
@@ -4852,7 +4852,7 @@
           <w:sz w:val="20"/>
           <w:szCs w:val="20"/>
         </w:rPr>
-        <w:t xml:space="preserve">Adam: 😱😱</w:t>
+        <w:t xml:space="preserve">Kelsey: 😱😱</w:t>
       </w:r>
     </w:p>
     <w:p>
@@ -4917,7 +4917,7 @@
           <w:sz w:val="20"/>
           <w:szCs w:val="20"/>
         </w:rPr>
-        <w:t xml:space="preserve">Adam:  🥰🥰</w:t>
+        <w:t xml:space="preserve">Kelsey:  🥰🥰</w:t>
       </w:r>
     </w:p>
     <w:p>
@@ -5002,7 +5002,7 @@
           <w:sz w:val="20"/>
           <w:szCs w:val="20"/>
         </w:rPr>
-        <w:t xml:space="preserve">Adam: 😂😂😂😂</w:t>
+        <w:t xml:space="preserve">Kelsey: 😂😂😂😂</w:t>
       </w:r>
     </w:p>
     <w:p>
@@ -5112,7 +5112,7 @@
           <w:sz w:val="20"/>
           <w:szCs w:val="20"/>
         </w:rPr>
-        <w:t xml:space="preserve">Adam: 😂😂👏👏</w:t>
+        <w:t xml:space="preserve">Kelsey: 😂😂👏👏</w:t>
       </w:r>
     </w:p>
     <w:p>
@@ -5368,7 +5368,7 @@
           <w:sz w:val="20"/>
           <w:szCs w:val="20"/>
         </w:rPr>
-        <w:t xml:space="preserve">Adam: 💜💜</w:t>
+        <w:t xml:space="preserve">Kelsey: 💜💜</w:t>
       </w:r>
     </w:p>
     <w:p>
@@ -5478,7 +5478,7 @@
           <w:sz w:val="20"/>
           <w:szCs w:val="20"/>
         </w:rPr>
-        <w:t xml:space="preserve">Adam: 💛💛</w:t>
+        <w:t xml:space="preserve">Kelsey: 💛💛</w:t>
       </w:r>
     </w:p>
     <w:p>
@@ -5518,7 +5518,7 @@
           <w:sz w:val="20"/>
           <w:szCs w:val="20"/>
         </w:rPr>
-        <w:t xml:space="preserve">Adam: It's under investigation </w:t>
+        <w:t xml:space="preserve">Kelsey: It's under investigation </w:t>
       </w:r>
     </w:p>
     <w:p>
@@ -5747,7 +5747,7 @@
           <w:sz w:val="20"/>
           <w:szCs w:val="20"/>
         </w:rPr>
-        <w:t xml:space="preserve">Adam: 👏👏💛💛</w:t>
+        <w:t xml:space="preserve">Kelsey: 👏👏💛💛</w:t>
       </w:r>
     </w:p>
     <w:p>
@@ -5812,7 +5812,7 @@
           <w:sz w:val="20"/>
           <w:szCs w:val="20"/>
         </w:rPr>
-        <w:t xml:space="preserve">Adam: 🥰🥰</w:t>
+        <w:t xml:space="preserve">Kelsey: 🥰🥰</w:t>
       </w:r>
     </w:p>
     <w:p>
@@ -5897,7 +5897,7 @@
           <w:sz w:val="20"/>
           <w:szCs w:val="20"/>
         </w:rPr>
-        <w:t xml:space="preserve">Adam: ⚓️🐕🐕</w:t>
+        <w:t xml:space="preserve">Kelsey: ⚓️🐕🐕</w:t>
       </w:r>
     </w:p>
     <w:p>
@@ -6256,7 +6256,7 @@
           <w:sz w:val="20"/>
           <w:szCs w:val="20"/>
         </w:rPr>
-        <w:t xml:space="preserve">Adam: 11/10 Byron. 👏👏</w:t>
+        <w:t xml:space="preserve">Kelsey: 11/10 Byron. 👏👏</w:t>
       </w:r>
     </w:p>
     <w:p>
@@ -6403,7 +6403,7 @@
           <w:sz w:val="20"/>
           <w:szCs w:val="20"/>
         </w:rPr>
-        <w:t xml:space="preserve">Adam: ☺️☺️</w:t>
+        <w:t xml:space="preserve">Kelsey: ☺️☺️</w:t>
       </w:r>
     </w:p>
     <w:p>
@@ -6494,7 +6494,7 @@
           <w:sz w:val="20"/>
           <w:szCs w:val="20"/>
         </w:rPr>
-        <w:t xml:space="preserve">Adam: 💛💛💛</w:t>
+        <w:t xml:space="preserve">Kelsey: 💛💛💛</w:t>
       </w:r>
     </w:p>
     <w:p>
@@ -6702,7 +6702,7 @@
           <w:sz w:val="20"/>
           <w:szCs w:val="20"/>
         </w:rPr>
-        <w:t xml:space="preserve">Adam: 💛💛💛</w:t>
+        <w:t xml:space="preserve">Kelsey: 💛💛💛</w:t>
       </w:r>
     </w:p>
     <w:p>
@@ -6833,7 +6833,7 @@
           <w:sz w:val="20"/>
           <w:szCs w:val="20"/>
         </w:rPr>
-        <w:t xml:space="preserve">Adam: 😭 Byron 10/10. So sorry to hear that Della sensed your weak spot </w:t>
+        <w:t xml:space="preserve">Kelsey: 😭 Byron 10/10. So sorry to hear that Della sensed your weak spot </w:t>
       </w:r>
     </w:p>
     <w:p>
@@ -6990,7 +6990,7 @@
           <w:sz w:val="20"/>
           <w:szCs w:val="20"/>
         </w:rPr>
-        <w:t xml:space="preserve">Adam: 💛💛💛</w:t>
+        <w:t xml:space="preserve">Kelsey: 💛💛💛</w:t>
       </w:r>
     </w:p>
     <w:p>
@@ -7055,7 +7055,7 @@
           <w:sz w:val="20"/>
           <w:szCs w:val="20"/>
         </w:rPr>
-        <w:t xml:space="preserve">Adam: 🌭☺️☺️</w:t>
+        <w:t xml:space="preserve">Kelsey: 🌭☺️☺️</w:t>
       </w:r>
     </w:p>
     <w:p>
@@ -7120,27 +7120,27 @@
           <w:sz w:val="20"/>
           <w:szCs w:val="20"/>
         </w:rPr>
-        <w:t xml:space="preserve">Adam: 😭🥰🥰</w:t>
-      </w:r>
-    </w:p>
-    <w:p>
-      <w:pPr>
-        <w:pBdr>
-          <w:left w:val="single" w:color="c8a951" w:sz="12" w:space="8"/>
-        </w:pBdr>
-        <w:spacing w:after="0" w:before="60"/>
-        <w:ind w:left="360"/>
-      </w:pPr>
-      <w:r>
-        <w:rPr>
-          <w:rFonts w:ascii="Georgia" w:cs="Georgia" w:eastAsia="Georgia" w:hAnsi="Georgia"/>
-          <w:i/>
-          <w:iCs/>
-          <w:color w:val="8a6a50"/>
-          <w:sz w:val="20"/>
-          <w:szCs w:val="20"/>
-        </w:rPr>
-        <w:t xml:space="preserve">Adam: They drive a hard bargain </w:t>
+        <w:t xml:space="preserve">Kelsey: 😭🥰🥰</w:t>
+      </w:r>
+    </w:p>
+    <w:p>
+      <w:pPr>
+        <w:pBdr>
+          <w:left w:val="single" w:color="c8a951" w:sz="12" w:space="8"/>
+        </w:pBdr>
+        <w:spacing w:after="0" w:before="60"/>
+        <w:ind w:left="360"/>
+      </w:pPr>
+      <w:r>
+        <w:rPr>
+          <w:rFonts w:ascii="Georgia" w:cs="Georgia" w:eastAsia="Georgia" w:hAnsi="Georgia"/>
+          <w:i/>
+          <w:iCs/>
+          <w:color w:val="8a6a50"/>
+          <w:sz w:val="20"/>
+          <w:szCs w:val="20"/>
+        </w:rPr>
+        <w:t xml:space="preserve">Kelsey: They drive a hard bargain </w:t>
       </w:r>
     </w:p>
     <w:p>
@@ -7205,7 +7205,7 @@
           <w:sz w:val="20"/>
           <w:szCs w:val="20"/>
         </w:rPr>
-        <w:t xml:space="preserve">Adam: 💛💛💛</w:t>
+        <w:t xml:space="preserve">Kelsey: 💛💛💛</w:t>
       </w:r>
     </w:p>
     <w:p>
@@ -7290,7 +7290,7 @@
           <w:sz w:val="20"/>
           <w:szCs w:val="20"/>
         </w:rPr>
-        <w:t xml:space="preserve">Adam: 💛💛💛</w:t>
+        <w:t xml:space="preserve">Kelsey: 💛💛💛</w:t>
       </w:r>
     </w:p>
     <w:p>
@@ -7375,7 +7375,7 @@
           <w:sz w:val="20"/>
           <w:szCs w:val="20"/>
         </w:rPr>
-        <w:t xml:space="preserve">Adam: 🤦‍♀️🤣💛💛</w:t>
+        <w:t xml:space="preserve">Kelsey: 🤦‍♀️🤣💛💛</w:t>
       </w:r>
     </w:p>
     <w:p>
@@ -7505,7 +7505,7 @@
           <w:sz w:val="20"/>
           <w:szCs w:val="20"/>
         </w:rPr>
-        <w:t xml:space="preserve">Adam: 😍😍</w:t>
+        <w:t xml:space="preserve">Kelsey: 😍😍</w:t>
       </w:r>
     </w:p>
     <w:p>
@@ -7570,7 +7570,7 @@
           <w:sz w:val="20"/>
           <w:szCs w:val="20"/>
         </w:rPr>
-        <w:t xml:space="preserve">Adam: 🥰🥰</w:t>
+        <w:t xml:space="preserve">Kelsey: 🥰🥰</w:t>
       </w:r>
     </w:p>
     <w:p>
@@ -7675,7 +7675,7 @@
           <w:sz w:val="20"/>
           <w:szCs w:val="20"/>
         </w:rPr>
-        <w:t xml:space="preserve">Adam: What a jolly event! </w:t>
+        <w:t xml:space="preserve">Kelsey: What a jolly event! </w:t>
       </w:r>
     </w:p>
     <w:p>
@@ -7740,7 +7740,7 @@
           <w:sz w:val="20"/>
           <w:szCs w:val="20"/>
         </w:rPr>
-        <w:t xml:space="preserve">Adam: We'll have to put out a nextdoor alert. The whole neighborhood should be on alert for such a suspici</w:t>
+        <w:t xml:space="preserve">Kelsey: We'll have to put out a nextdoor alert. The whole neighborhood should be on alert for such a suspici</w:t>
       </w:r>
     </w:p>
     <w:p>
@@ -7838,7 +7838,7 @@
           <w:sz w:val="20"/>
           <w:szCs w:val="20"/>
         </w:rPr>
-        <w:t xml:space="preserve">Adam: We'll have to put out a nextdoor alert. The whole neighborhood should be on alert for such a suspici</w:t>
+        <w:t xml:space="preserve">Kelsey: We'll have to put out a nextdoor alert. The whole neighborhood should be on alert for such a suspici</w:t>
       </w:r>
     </w:p>
     <w:p>
@@ -7923,7 +7923,7 @@
           <w:sz w:val="20"/>
           <w:szCs w:val="20"/>
         </w:rPr>
-        <w:t xml:space="preserve">Adam:   💛💛</w:t>
+        <w:t xml:space="preserve">Kelsey:   💛💛</w:t>
       </w:r>
     </w:p>
     <w:p>
@@ -8085,7 +8085,7 @@
           <w:sz w:val="20"/>
           <w:szCs w:val="20"/>
         </w:rPr>
-        <w:t xml:space="preserve">Adam: 💛💛</w:t>
+        <w:t xml:space="preserve">Kelsey: 💛💛</w:t>
       </w:r>
     </w:p>
     <w:p>
@@ -8163,7 +8163,7 @@
           <w:sz w:val="20"/>
           <w:szCs w:val="20"/>
         </w:rPr>
-        <w:t xml:space="preserve">Adam: 💛💛😂😂</w:t>
+        <w:t xml:space="preserve">Kelsey: 💛💛😂😂</w:t>
       </w:r>
     </w:p>
     <w:p>
@@ -8228,7 +8228,7 @@
           <w:sz w:val="20"/>
           <w:szCs w:val="20"/>
         </w:rPr>
-        <w:t xml:space="preserve">Adam: 🤣🥰🥰</w:t>
+        <w:t xml:space="preserve">Kelsey: 🤣🥰🥰</w:t>
       </w:r>
     </w:p>
     <w:p>
@@ -8293,27 +8293,27 @@
           <w:sz w:val="20"/>
           <w:szCs w:val="20"/>
         </w:rPr>
-        <w:t xml:space="preserve">Adam: 🤣😂</w:t>
-      </w:r>
-    </w:p>
-    <w:p>
-      <w:pPr>
-        <w:pBdr>
-          <w:left w:val="single" w:color="c8a951" w:sz="12" w:space="8"/>
-        </w:pBdr>
-        <w:spacing w:after="0" w:before="60"/>
-        <w:ind w:left="360"/>
-      </w:pPr>
-      <w:r>
-        <w:rPr>
-          <w:rFonts w:ascii="Georgia" w:cs="Georgia" w:eastAsia="Georgia" w:hAnsi="Georgia"/>
-          <w:i/>
-          <w:iCs/>
-          <w:color w:val="8a6a50"/>
-          <w:sz w:val="20"/>
-          <w:szCs w:val="20"/>
-        </w:rPr>
-        <w:t xml:space="preserve">Adam: Amazing Byron. I wouldn't know nearly as much of the pups lives without you. </w:t>
+        <w:t xml:space="preserve">Kelsey: 🤣😂</w:t>
+      </w:r>
+    </w:p>
+    <w:p>
+      <w:pPr>
+        <w:pBdr>
+          <w:left w:val="single" w:color="c8a951" w:sz="12" w:space="8"/>
+        </w:pBdr>
+        <w:spacing w:after="0" w:before="60"/>
+        <w:ind w:left="360"/>
+      </w:pPr>
+      <w:r>
+        <w:rPr>
+          <w:rFonts w:ascii="Georgia" w:cs="Georgia" w:eastAsia="Georgia" w:hAnsi="Georgia"/>
+          <w:i/>
+          <w:iCs/>
+          <w:color w:val="8a6a50"/>
+          <w:sz w:val="20"/>
+          <w:szCs w:val="20"/>
+        </w:rPr>
+        <w:t xml:space="preserve">Kelsey: Amazing Byron. I wouldn't know nearly as much of the pups lives without you. </w:t>
       </w:r>
     </w:p>
     <w:p>
@@ -8663,7 +8663,7 @@
           <w:sz w:val="20"/>
           <w:szCs w:val="20"/>
         </w:rPr>
-        <w:t xml:space="preserve">Adam: 🤪💙</w:t>
+        <w:t xml:space="preserve">Kelsey: 🤪💙</w:t>
       </w:r>
     </w:p>
     <w:p>
@@ -8748,7 +8748,7 @@
           <w:sz w:val="20"/>
           <w:szCs w:val="20"/>
         </w:rPr>
-        <w:t xml:space="preserve">Adam: 💜💜</w:t>
+        <w:t xml:space="preserve">Kelsey: 💜💜</w:t>
       </w:r>
     </w:p>
     <w:p>
@@ -8813,7 +8813,7 @@
           <w:sz w:val="20"/>
           <w:szCs w:val="20"/>
         </w:rPr>
-        <w:t xml:space="preserve">Adam: 🤣🤣</w:t>
+        <w:t xml:space="preserve">Kelsey: 🤣🤣</w:t>
       </w:r>
     </w:p>
     <w:p>
@@ -8924,27 +8924,27 @@
           <w:sz w:val="20"/>
           <w:szCs w:val="20"/>
         </w:rPr>
-        <w:t xml:space="preserve">Adam: 🤪🤣🤣🤣</w:t>
-      </w:r>
-    </w:p>
-    <w:p>
-      <w:pPr>
-        <w:pBdr>
-          <w:left w:val="single" w:color="c8a951" w:sz="12" w:space="8"/>
-        </w:pBdr>
-        <w:spacing w:after="0" w:before="60"/>
-        <w:ind w:left="360"/>
-      </w:pPr>
-      <w:r>
-        <w:rPr>
-          <w:rFonts w:ascii="Georgia" w:cs="Georgia" w:eastAsia="Georgia" w:hAnsi="Georgia"/>
-          <w:i/>
-          <w:iCs/>
-          <w:color w:val="8a6a50"/>
-          <w:sz w:val="20"/>
-          <w:szCs w:val="20"/>
-        </w:rPr>
-        <w:t xml:space="preserve">Adam: 10/10</w:t>
+        <w:t xml:space="preserve">Kelsey: 🤪🤣🤣🤣</w:t>
+      </w:r>
+    </w:p>
+    <w:p>
+      <w:pPr>
+        <w:pBdr>
+          <w:left w:val="single" w:color="c8a951" w:sz="12" w:space="8"/>
+        </w:pBdr>
+        <w:spacing w:after="0" w:before="60"/>
+        <w:ind w:left="360"/>
+      </w:pPr>
+      <w:r>
+        <w:rPr>
+          <w:rFonts w:ascii="Georgia" w:cs="Georgia" w:eastAsia="Georgia" w:hAnsi="Georgia"/>
+          <w:i/>
+          <w:iCs/>
+          <w:color w:val="8a6a50"/>
+          <w:sz w:val="20"/>
+          <w:szCs w:val="20"/>
+        </w:rPr>
+        <w:t xml:space="preserve">Kelsey: 10/10</w:t>
       </w:r>
     </w:p>
     <w:p>
@@ -9009,7 +9009,7 @@
           <w:sz w:val="20"/>
           <w:szCs w:val="20"/>
         </w:rPr>
-        <w:t xml:space="preserve">Adam: 💜💜💜</w:t>
+        <w:t xml:space="preserve">Kelsey: 💜💜💜</w:t>
       </w:r>
     </w:p>
     <w:p>
@@ -9074,7 +9074,7 @@
           <w:sz w:val="20"/>
           <w:szCs w:val="20"/>
         </w:rPr>
-        <w:t xml:space="preserve">Adam: 💜💜💜</w:t>
+        <w:t xml:space="preserve">Kelsey: 💜💜💜</w:t>
       </w:r>
     </w:p>
     <w:p>
@@ -9178,7 +9178,7 @@
           <w:sz w:val="20"/>
           <w:szCs w:val="20"/>
         </w:rPr>
-        <w:t xml:space="preserve">Adam: 🥹🥹</w:t>
+        <w:t xml:space="preserve">Kelsey: 🥹🥹</w:t>
       </w:r>
     </w:p>
     <w:p>
@@ -9394,7 +9394,7 @@
           <w:sz w:val="20"/>
           <w:szCs w:val="20"/>
         </w:rPr>
-        <w:t xml:space="preserve">Adam: 😂😂</w:t>
+        <w:t xml:space="preserve">Kelsey: 😂😂</w:t>
       </w:r>
     </w:p>
     <w:p>
@@ -9459,7 +9459,7 @@
           <w:sz w:val="20"/>
           <w:szCs w:val="20"/>
         </w:rPr>
-        <w:t xml:space="preserve">Adam: Oh no! Looks like someone could use a fan and some hand fed carrots </w:t>
+        <w:t xml:space="preserve">Kelsey: Oh no! Looks like someone could use a fan and some hand fed carrots </w:t>
       </w:r>
     </w:p>
     <w:p>
@@ -9564,7 +9564,7 @@
           <w:sz w:val="20"/>
           <w:szCs w:val="20"/>
         </w:rPr>
-        <w:t xml:space="preserve">Adam: 🔥🔥🥰</w:t>
+        <w:t xml:space="preserve">Kelsey: 🔥🔥🥰</w:t>
       </w:r>
     </w:p>
     <w:p>
@@ -9649,7 +9649,7 @@
           <w:sz w:val="20"/>
           <w:szCs w:val="20"/>
         </w:rPr>
-        <w:t xml:space="preserve">Adam: ♾♾♾</w:t>
+        <w:t xml:space="preserve">Kelsey: ♾♾♾</w:t>
       </w:r>
     </w:p>
     <w:p>
@@ -9804,7 +9804,7 @@
           <w:sz w:val="20"/>
           <w:szCs w:val="20"/>
         </w:rPr>
-        <w:t xml:space="preserve">Adam: ☺️</w:t>
+        <w:t xml:space="preserve">Kelsey: ☺️</w:t>
       </w:r>
     </w:p>
     <w:p>
@@ -9869,7 +9869,7 @@
           <w:sz w:val="20"/>
           <w:szCs w:val="20"/>
         </w:rPr>
-        <w:t xml:space="preserve">Adam: 🥰🥰</w:t>
+        <w:t xml:space="preserve">Kelsey: 🥰🥰</w:t>
       </w:r>
     </w:p>
     <w:p>
@@ -9934,7 +9934,7 @@
           <w:sz w:val="20"/>
           <w:szCs w:val="20"/>
         </w:rPr>
-        <w:t xml:space="preserve">Adam: The unsung heroes of the Marin trail keepers </w:t>
+        <w:t xml:space="preserve">Kelsey: The unsung heroes of the Marin trail keepers </w:t>
       </w:r>
     </w:p>
     <w:p>
@@ -10149,7 +10149,7 @@
           <w:sz w:val="20"/>
           <w:szCs w:val="20"/>
         </w:rPr>
-        <w:t xml:space="preserve">Adam: 😂🤘🤘</w:t>
+        <w:t xml:space="preserve">Kelsey: 😂🤘🤘</w:t>
       </w:r>
     </w:p>
     <w:p>
@@ -10299,7 +10299,7 @@
           <w:sz w:val="20"/>
           <w:szCs w:val="20"/>
         </w:rPr>
-        <w:t xml:space="preserve">Adam: 🤫🤫</w:t>
+        <w:t xml:space="preserve">Kelsey: 🤫🤫</w:t>
       </w:r>
     </w:p>
     <w:p>
@@ -10494,7 +10494,7 @@
           <w:sz w:val="20"/>
           <w:szCs w:val="20"/>
         </w:rPr>
-        <w:t xml:space="preserve">Adam: 😝😝</w:t>
+        <w:t xml:space="preserve">Kelsey: 😝😝</w:t>
       </w:r>
     </w:p>
     <w:p>
@@ -10559,7 +10559,7 @@
           <w:sz w:val="20"/>
           <w:szCs w:val="20"/>
         </w:rPr>
-        <w:t xml:space="preserve">Adam: 😝😝</w:t>
+        <w:t xml:space="preserve">Kelsey: 😝😝</w:t>
       </w:r>
     </w:p>
     <w:p>
@@ -10644,7 +10644,7 @@
           <w:sz w:val="20"/>
           <w:szCs w:val="20"/>
         </w:rPr>
-        <w:t xml:space="preserve">Adam: 😆🥹</w:t>
+        <w:t xml:space="preserve">Kelsey: 😆🥹</w:t>
       </w:r>
     </w:p>
     <w:p>
@@ -10742,7 +10742,7 @@
           <w:sz w:val="20"/>
           <w:szCs w:val="20"/>
         </w:rPr>
-        <w:t xml:space="preserve">Adam: 😝😝</w:t>
+        <w:t xml:space="preserve">Kelsey: 😝😝</w:t>
       </w:r>
     </w:p>
     <w:p>
@@ -10898,7 +10898,7 @@
           <w:sz w:val="20"/>
           <w:szCs w:val="20"/>
         </w:rPr>
-        <w:t xml:space="preserve">Adam: 🥰🥰</w:t>
+        <w:t xml:space="preserve">Kelsey: 🥰🥰</w:t>
       </w:r>
     </w:p>
     <w:p>
@@ -10963,7 +10963,7 @@
           <w:sz w:val="20"/>
           <w:szCs w:val="20"/>
         </w:rPr>
-        <w:t xml:space="preserve">Adam: Aww baby girl 🥹</w:t>
+        <w:t xml:space="preserve">Kelsey: Aww baby girl 🥹</w:t>
       </w:r>
     </w:p>
     <w:p>
@@ -11204,7 +11204,7 @@
           <w:sz w:val="20"/>
           <w:szCs w:val="20"/>
         </w:rPr>
-        <w:t xml:space="preserve">Adam: 🙏🙏</w:t>
+        <w:t xml:space="preserve">Kelsey: 🙏🙏</w:t>
       </w:r>
     </w:p>
     <w:p>
@@ -11289,7 +11289,7 @@
           <w:sz w:val="20"/>
           <w:szCs w:val="20"/>
         </w:rPr>
-        <w:t xml:space="preserve">Adam: 🙏🙏</w:t>
+        <w:t xml:space="preserve">Kelsey: 🙏🙏</w:t>
       </w:r>
     </w:p>
     <w:p>
@@ -11354,7 +11354,7 @@
           <w:sz w:val="20"/>
           <w:szCs w:val="20"/>
         </w:rPr>
-        <w:t xml:space="preserve">Adam: 🙏🙏</w:t>
+        <w:t xml:space="preserve">Kelsey: 🙏🙏</w:t>
       </w:r>
     </w:p>
     <w:p>
@@ -11484,7 +11484,7 @@
           <w:sz w:val="20"/>
           <w:szCs w:val="20"/>
         </w:rPr>
-        <w:t xml:space="preserve">Adam: 🥹🥰🥰</w:t>
+        <w:t xml:space="preserve">Kelsey: 🥹🥰🥰</w:t>
       </w:r>
     </w:p>
     <w:p>
@@ -11737,7 +11737,7 @@
           <w:sz w:val="20"/>
           <w:szCs w:val="20"/>
         </w:rPr>
-        <w:t xml:space="preserve">Adam: 🤠🤠</w:t>
+        <w:t xml:space="preserve">Kelsey: 🤠🤠</w:t>
       </w:r>
     </w:p>
     <w:p>
@@ -11802,7 +11802,7 @@
           <w:sz w:val="20"/>
           <w:szCs w:val="20"/>
         </w:rPr>
-        <w:t xml:space="preserve">Adam: 🥰🥰🥰</w:t>
+        <w:t xml:space="preserve">Kelsey: 🥰🥰🥰</w:t>
       </w:r>
     </w:p>
     <w:p>
@@ -11867,7 +11867,7 @@
           <w:sz w:val="20"/>
           <w:szCs w:val="20"/>
         </w:rPr>
-        <w:t xml:space="preserve">Adam: 😍😍</w:t>
+        <w:t xml:space="preserve">Kelsey: 😍😍</w:t>
       </w:r>
     </w:p>
     <w:p>
@@ -11932,7 +11932,7 @@
           <w:sz w:val="20"/>
           <w:szCs w:val="20"/>
         </w:rPr>
-        <w:t xml:space="preserve">Adam: They're on the case! </w:t>
+        <w:t xml:space="preserve">Kelsey: They're on the case! </w:t>
       </w:r>
     </w:p>
     <w:p>
@@ -12282,7 +12282,7 @@
           <w:sz w:val="20"/>
           <w:szCs w:val="20"/>
         </w:rPr>
-        <w:t xml:space="preserve">Adam: 🧐🐶</w:t>
+        <w:t xml:space="preserve">Kelsey: 🧐🐶</w:t>
       </w:r>
     </w:p>
     <w:p>
@@ -12405,7 +12405,7 @@
           <w:sz w:val="20"/>
           <w:szCs w:val="20"/>
         </w:rPr>
-        <w:t xml:space="preserve">Adam: 🤣 I hope you make it back! </w:t>
+        <w:t xml:space="preserve">Kelsey: 🤣 I hope you make it back! </w:t>
       </w:r>
     </w:p>
     <w:p>
@@ -12490,7 +12490,7 @@
           <w:sz w:val="20"/>
           <w:szCs w:val="20"/>
         </w:rPr>
-        <w:t xml:space="preserve">Adam: Incredibly shameful. We need to have a talk with her about this shady behavior </w:t>
+        <w:t xml:space="preserve">Kelsey: Incredibly shameful. We need to have a talk with her about this shady behavior </w:t>
       </w:r>
     </w:p>
     <w:p>
@@ -12597,7 +12597,7 @@
           <w:sz w:val="20"/>
           <w:szCs w:val="20"/>
         </w:rPr>
-        <w:t xml:space="preserve">Adam: Immensely so! </w:t>
+        <w:t xml:space="preserve">Kelsey: Immensely so! </w:t>
       </w:r>
     </w:p>
     <w:p>
@@ -12688,7 +12688,7 @@
           <w:sz w:val="20"/>
           <w:szCs w:val="20"/>
         </w:rPr>
-        <w:t xml:space="preserve">Adam: 🙈🙈</w:t>
+        <w:t xml:space="preserve">Kelsey: 🙈🙈</w:t>
       </w:r>
     </w:p>
     <w:p>
@@ -13090,7 +13090,7 @@
           <w:sz w:val="20"/>
           <w:szCs w:val="20"/>
         </w:rPr>
-        <w:t xml:space="preserve">Adam:  🤓</w:t>
+        <w:t xml:space="preserve">Kelsey:  🤓</w:t>
       </w:r>
     </w:p>
     <w:p>
@@ -13838,7 +13838,7 @@
           <w:sz w:val="20"/>
           <w:szCs w:val="20"/>
         </w:rPr>
-        <w:t xml:space="preserve">Adam: 💜💜💜💜</w:t>
+        <w:t xml:space="preserve">Kelsey: 💜💜💜💜</w:t>
       </w:r>
     </w:p>
     <w:p>
@@ -13968,7 +13968,7 @@
           <w:sz w:val="20"/>
           <w:szCs w:val="20"/>
         </w:rPr>
-        <w:t xml:space="preserve">Adam: 🧡🧡</w:t>
+        <w:t xml:space="preserve">Kelsey: 🧡🧡</w:t>
       </w:r>
     </w:p>
     <w:p>
@@ -14033,7 +14033,7 @@
           <w:sz w:val="20"/>
           <w:szCs w:val="20"/>
         </w:rPr>
-        <w:t xml:space="preserve">Adam: 😂💛</w:t>
+        <w:t xml:space="preserve">Kelsey: 😂💛</w:t>
       </w:r>
     </w:p>
     <w:p>
@@ -14137,7 +14137,7 @@
           <w:sz w:val="20"/>
           <w:szCs w:val="20"/>
         </w:rPr>
-        <w:t xml:space="preserve">Adam: 😍😍😍</w:t>
+        <w:t xml:space="preserve">Kelsey: 😍😍😍</w:t>
       </w:r>
     </w:p>
     <w:p>
@@ -14500,7 +14500,7 @@
           <w:sz w:val="20"/>
           <w:szCs w:val="20"/>
         </w:rPr>
-        <w:t xml:space="preserve">Adam: 🤣🤣</w:t>
+        <w:t xml:space="preserve">Kelsey: 🤣🤣</w:t>
       </w:r>
     </w:p>
     <w:p>
@@ -14643,7 +14643,7 @@
           <w:sz w:val="20"/>
           <w:szCs w:val="20"/>
         </w:rPr>
-        <w:t xml:space="preserve">Adam: 😝🥰</w:t>
+        <w:t xml:space="preserve">Kelsey: 😝🥰</w:t>
       </w:r>
     </w:p>
     <w:p>
@@ -14708,7 +14708,7 @@
           <w:sz w:val="20"/>
           <w:szCs w:val="20"/>
         </w:rPr>
-        <w:t xml:space="preserve">Adam: 🤣🤣🙏🙏</w:t>
+        <w:t xml:space="preserve">Kelsey: 🤣🤣🙏🙏</w:t>
       </w:r>
     </w:p>
     <w:p>
@@ -14793,7 +14793,7 @@
           <w:sz w:val="20"/>
           <w:szCs w:val="20"/>
         </w:rPr>
-        <w:t xml:space="preserve">Adam: 👏👏</w:t>
+        <w:t xml:space="preserve">Kelsey: 👏👏</w:t>
       </w:r>
     </w:p>
     <w:p>
@@ -14858,7 +14858,7 @@
           <w:sz w:val="20"/>
           <w:szCs w:val="20"/>
         </w:rPr>
-        <w:t xml:space="preserve">Adam: 🤪🤪</w:t>
+        <w:t xml:space="preserve">Kelsey: 🤪🤪</w:t>
       </w:r>
     </w:p>
     <w:p>
@@ -15371,7 +15371,7 @@
           <w:sz w:val="20"/>
           <w:szCs w:val="20"/>
         </w:rPr>
-        <w:t xml:space="preserve">Adam: 🤣🤣</w:t>
+        <w:t xml:space="preserve">Kelsey: 🤣🤣</w:t>
       </w:r>
     </w:p>
     <w:p>
@@ -15674,7 +15674,7 @@
           <w:sz w:val="20"/>
           <w:szCs w:val="20"/>
         </w:rPr>
-        <w:t xml:space="preserve">Adam: 👌🥰🥰</w:t>
+        <w:t xml:space="preserve">Kelsey: 👌🥰🥰</w:t>
       </w:r>
     </w:p>
     <w:p>
@@ -15759,7 +15759,7 @@
           <w:sz w:val="20"/>
           <w:szCs w:val="20"/>
         </w:rPr>
-        <w:t xml:space="preserve">Adam: 😁😆😆</w:t>
+        <w:t xml:space="preserve">Kelsey: 😁😆😆</w:t>
       </w:r>
     </w:p>
     <w:p>
@@ -15824,7 +15824,7 @@
           <w:sz w:val="20"/>
           <w:szCs w:val="20"/>
         </w:rPr>
-        <w:t xml:space="preserve">Adam: 😍⛳️</w:t>
+        <w:t xml:space="preserve">Kelsey: 😍⛳️</w:t>
       </w:r>
     </w:p>
     <w:p>
@@ -16238,7 +16238,7 @@
           <w:sz w:val="20"/>
           <w:szCs w:val="20"/>
         </w:rPr>
-        <w:t xml:space="preserve">Adam: 🤣🤪</w:t>
+        <w:t xml:space="preserve">Kelsey: 🤣🤪</w:t>
       </w:r>
     </w:p>
     <w:p>
@@ -16329,7 +16329,7 @@
           <w:sz w:val="20"/>
           <w:szCs w:val="20"/>
         </w:rPr>
-        <w:t xml:space="preserve">Adam: 🤣💜💜</w:t>
+        <w:t xml:space="preserve">Kelsey: 🤣💜💜</w:t>
       </w:r>
     </w:p>
     <w:p>
@@ -16538,7 +16538,7 @@
           <w:sz w:val="20"/>
           <w:szCs w:val="20"/>
         </w:rPr>
-        <w:t xml:space="preserve">Adam: That is hysterical 🤣🤣</w:t>
+        <w:t xml:space="preserve">Kelsey: That is hysterical 🤣🤣</w:t>
       </w:r>
     </w:p>
     <w:p>
@@ -16655,7 +16655,7 @@
           <w:sz w:val="20"/>
           <w:szCs w:val="20"/>
         </w:rPr>
-        <w:t xml:space="preserve">Adam: 😊😊</w:t>
+        <w:t xml:space="preserve">Kelsey: 😊😊</w:t>
       </w:r>
     </w:p>
     <w:p>
@@ -16810,7 +16810,7 @@
           <w:sz w:val="20"/>
           <w:szCs w:val="20"/>
         </w:rPr>
-        <w:t xml:space="preserve">Adam: 🤣🤣😭</w:t>
+        <w:t xml:space="preserve">Kelsey: 🤣🤣😭</w:t>
       </w:r>
     </w:p>
     <w:p>
@@ -16940,7 +16940,7 @@
           <w:sz w:val="20"/>
           <w:szCs w:val="20"/>
         </w:rPr>
-        <w:t xml:space="preserve">Adam: Incredible!! </w:t>
+        <w:t xml:space="preserve">Kelsey: Incredible!! </w:t>
       </w:r>
     </w:p>
     <w:p>
@@ -17297,7 +17297,7 @@
           <w:sz w:val="20"/>
           <w:szCs w:val="20"/>
         </w:rPr>
-        <w:t xml:space="preserve">Adam: 👏👏👏</w:t>
+        <w:t xml:space="preserve">Kelsey: 👏👏👏</w:t>
       </w:r>
     </w:p>
     <w:p>
@@ -17497,7 +17497,7 @@
           <w:sz w:val="20"/>
           <w:szCs w:val="20"/>
         </w:rPr>
-        <w:t xml:space="preserve">Adam: 😆🫠🫠</w:t>
+        <w:t xml:space="preserve">Kelsey: 😆🫠🫠</w:t>
       </w:r>
     </w:p>
     <w:p>
@@ -17743,7 +17743,7 @@
           <w:sz w:val="20"/>
           <w:szCs w:val="20"/>
         </w:rPr>
-        <w:t xml:space="preserve">Adam: 🤣🥰🥰</w:t>
+        <w:t xml:space="preserve">Kelsey: 🤣🥰🥰</w:t>
       </w:r>
     </w:p>
     <w:p>
@@ -18151,7 +18151,7 @@
           <w:sz w:val="20"/>
           <w:szCs w:val="20"/>
         </w:rPr>
-        <w:t xml:space="preserve">Adam: 😆😆👏👏</w:t>
+        <w:t xml:space="preserve">Kelsey: 😆😆👏👏</w:t>
       </w:r>
     </w:p>
     <w:p>
@@ -18391,7 +18391,7 @@
           <w:sz w:val="20"/>
           <w:szCs w:val="20"/>
         </w:rPr>
-        <w:t xml:space="preserve">Adam: 😝😝</w:t>
+        <w:t xml:space="preserve">Kelsey: 😝😝</w:t>
       </w:r>
     </w:p>
     <w:p>
@@ -18476,7 +18476,7 @@
           <w:sz w:val="20"/>
           <w:szCs w:val="20"/>
         </w:rPr>
-        <w:t xml:space="preserve">Adam: 😝😝</w:t>
+        <w:t xml:space="preserve">Kelsey: 😝😝</w:t>
       </w:r>
     </w:p>
     <w:p>
@@ -18606,27 +18606,27 @@
           <w:sz w:val="20"/>
           <w:szCs w:val="20"/>
         </w:rPr>
-        <w:t xml:space="preserve">Adam: 😆😆</w:t>
-      </w:r>
-    </w:p>
-    <w:p>
-      <w:pPr>
-        <w:pBdr>
-          <w:left w:val="single" w:color="c8a951" w:sz="12" w:space="8"/>
-        </w:pBdr>
-        <w:spacing w:after="0" w:before="60"/>
-        <w:ind w:left="360"/>
-      </w:pPr>
-      <w:r>
-        <w:rPr>
-          <w:rFonts w:ascii="Georgia" w:cs="Georgia" w:eastAsia="Georgia" w:hAnsi="Georgia"/>
-          <w:i/>
-          <w:iCs/>
-          <w:color w:val="8a6a50"/>
-          <w:sz w:val="20"/>
-          <w:szCs w:val="20"/>
-        </w:rPr>
-        <w:t xml:space="preserve">Adam: She's a ghost in that last frame! </w:t>
+        <w:t xml:space="preserve">Kelsey: 😆😆</w:t>
+      </w:r>
+    </w:p>
+    <w:p>
+      <w:pPr>
+        <w:pBdr>
+          <w:left w:val="single" w:color="c8a951" w:sz="12" w:space="8"/>
+        </w:pBdr>
+        <w:spacing w:after="0" w:before="60"/>
+        <w:ind w:left="360"/>
+      </w:pPr>
+      <w:r>
+        <w:rPr>
+          <w:rFonts w:ascii="Georgia" w:cs="Georgia" w:eastAsia="Georgia" w:hAnsi="Georgia"/>
+          <w:i/>
+          <w:iCs/>
+          <w:color w:val="8a6a50"/>
+          <w:sz w:val="20"/>
+          <w:szCs w:val="20"/>
+        </w:rPr>
+        <w:t xml:space="preserve">Kelsey: She's a ghost in that last frame! </w:t>
       </w:r>
     </w:p>
     <w:p>
@@ -18840,7 +18840,7 @@
           <w:sz w:val="20"/>
           <w:szCs w:val="20"/>
         </w:rPr>
-        <w:t xml:space="preserve">Adam: 😆😆🥰</w:t>
+        <w:t xml:space="preserve">Kelsey: 😆😆🥰</w:t>
       </w:r>
     </w:p>
     <w:p>
@@ -18995,7 +18995,7 @@
           <w:sz w:val="20"/>
           <w:szCs w:val="20"/>
         </w:rPr>
-        <w:t xml:space="preserve">Adam: 😝😝😝</w:t>
+        <w:t xml:space="preserve">Kelsey: 😝😝😝</w:t>
       </w:r>
     </w:p>
     <w:p>
@@ -19189,7 +19189,7 @@
           <w:sz w:val="20"/>
           <w:szCs w:val="20"/>
         </w:rPr>
-        <w:t xml:space="preserve">Adam: 👏👏😆🎬</w:t>
+        <w:t xml:space="preserve">Kelsey: 👏👏😆🎬</w:t>
       </w:r>
     </w:p>
     <w:p>
@@ -19705,7 +19705,7 @@
           <w:sz w:val="20"/>
           <w:szCs w:val="20"/>
         </w:rPr>
-        <w:t xml:space="preserve">Adam: 🤪🤪</w:t>
+        <w:t xml:space="preserve">Kelsey: 🤪🤪</w:t>
       </w:r>
     </w:p>
     <w:p>
@@ -19854,7 +19854,7 @@
           <w:sz w:val="20"/>
           <w:szCs w:val="20"/>
         </w:rPr>
-        <w:t xml:space="preserve">Adam: 😂😂</w:t>
+        <w:t xml:space="preserve">Kelsey: 😂😂</w:t>
       </w:r>
     </w:p>
     <w:p>
@@ -20417,7 +20417,7 @@
           <w:sz w:val="20"/>
           <w:szCs w:val="20"/>
         </w:rPr>
-        <w:t xml:space="preserve">Adam: 🤣🐶✈️</w:t>
+        <w:t xml:space="preserve">Kelsey: 🤣🐶✈️</w:t>
       </w:r>
     </w:p>
     <w:p>
@@ -20592,7 +20592,7 @@
           <w:sz w:val="20"/>
           <w:szCs w:val="20"/>
         </w:rPr>
-        <w:t xml:space="preserve">Adam: Hahah </w:t>
+        <w:t xml:space="preserve">Kelsey: Hahah </w:t>
       </w:r>
     </w:p>
     <w:p>
@@ -20677,7 +20677,7 @@
           <w:sz w:val="20"/>
           <w:szCs w:val="20"/>
         </w:rPr>
-        <w:t xml:space="preserve">Adam: 🤣🤣</w:t>
+        <w:t xml:space="preserve">Kelsey: 🤣🤣</w:t>
       </w:r>
     </w:p>
     <w:p>
@@ -20845,7 +20845,7 @@
           <w:sz w:val="20"/>
           <w:szCs w:val="20"/>
         </w:rPr>
-        <w:t xml:space="preserve">Adam: Hahaha 😝</w:t>
+        <w:t xml:space="preserve">Kelsey: Hahaha 😝</w:t>
       </w:r>
     </w:p>
     <w:p>
@@ -20995,7 +20995,7 @@
           <w:sz w:val="20"/>
           <w:szCs w:val="20"/>
         </w:rPr>
-        <w:t xml:space="preserve">Adam: Reacted 🔥 to “They remain cute when in a state of slumber, when …”</w:t>
+        <w:t xml:space="preserve">Kelsey: Reacted 🔥 to “They remain cute when in a state of slumber, when …”</w:t>
       </w:r>
     </w:p>
     <w:p>
@@ -21060,7 +21060,7 @@
           <w:sz w:val="20"/>
           <w:szCs w:val="20"/>
         </w:rPr>
-        <w:t xml:space="preserve">Adam: Reacted 🔥 to “They remain cute when in a state of slumber, when …”</w:t>
+        <w:t xml:space="preserve">Kelsey: Reacted 🔥 to “They remain cute when in a state of slumber, when …”</w:t>
       </w:r>
     </w:p>
     <w:p>
@@ -21145,27 +21145,27 @@
           <w:sz w:val="20"/>
           <w:szCs w:val="20"/>
         </w:rPr>
-        <w:t xml:space="preserve">Adam: Bryon, what a terror of a photo to open! </w:t>
-      </w:r>
-    </w:p>
-    <w:p>
-      <w:pPr>
-        <w:pBdr>
-          <w:left w:val="single" w:color="c8a951" w:sz="12" w:space="8"/>
-        </w:pBdr>
-        <w:spacing w:after="0" w:before="60"/>
-        <w:ind w:left="360"/>
-      </w:pPr>
-      <w:r>
-        <w:rPr>
-          <w:rFonts w:ascii="Georgia" w:cs="Georgia" w:eastAsia="Georgia" w:hAnsi="Georgia"/>
-          <w:i/>
-          <w:iCs/>
-          <w:color w:val="8a6a50"/>
-          <w:sz w:val="20"/>
-          <w:szCs w:val="20"/>
-        </w:rPr>
-        <w:t xml:space="preserve">Adam: Very very true. </w:t>
+        <w:t xml:space="preserve">Kelsey: Bryon, what a terror of a photo to open! </w:t>
+      </w:r>
+    </w:p>
+    <w:p>
+      <w:pPr>
+        <w:pBdr>
+          <w:left w:val="single" w:color="c8a951" w:sz="12" w:space="8"/>
+        </w:pBdr>
+        <w:spacing w:after="0" w:before="60"/>
+        <w:ind w:left="360"/>
+      </w:pPr>
+      <w:r>
+        <w:rPr>
+          <w:rFonts w:ascii="Georgia" w:cs="Georgia" w:eastAsia="Georgia" w:hAnsi="Georgia"/>
+          <w:i/>
+          <w:iCs/>
+          <w:color w:val="8a6a50"/>
+          <w:sz w:val="20"/>
+          <w:szCs w:val="20"/>
+        </w:rPr>
+        <w:t xml:space="preserve">Kelsey: Very very true. </w:t>
       </w:r>
     </w:p>
     <w:p>
@@ -21230,7 +21230,7 @@
           <w:sz w:val="20"/>
           <w:szCs w:val="20"/>
         </w:rPr>
-        <w:t xml:space="preserve">Adam: Very very true. </w:t>
+        <w:t xml:space="preserve">Kelsey: Very very true. </w:t>
       </w:r>
     </w:p>
     <w:p>
@@ -21295,7 +21295,7 @@
           <w:sz w:val="20"/>
           <w:szCs w:val="20"/>
         </w:rPr>
-        <w:t xml:space="preserve">Adam: Hahaha 🔥</w:t>
+        <w:t xml:space="preserve">Kelsey: Hahaha 🔥</w:t>
       </w:r>
     </w:p>
     <w:p>
@@ -21360,7 +21360,7 @@
           <w:sz w:val="20"/>
           <w:szCs w:val="20"/>
         </w:rPr>
-        <w:t xml:space="preserve">Adam: 😝😝</w:t>
+        <w:t xml:space="preserve">Kelsey: 😝😝</w:t>
       </w:r>
     </w:p>
     <w:p>
@@ -21470,7 +21470,7 @@
           <w:sz w:val="20"/>
           <w:szCs w:val="20"/>
         </w:rPr>
-        <w:t xml:space="preserve">Adam: 🫰🫰🫰</w:t>
+        <w:t xml:space="preserve">Kelsey: 🫰🫰🫰</w:t>
       </w:r>
     </w:p>
     <w:p>
@@ -21593,7 +21593,7 @@
           <w:sz w:val="20"/>
           <w:szCs w:val="20"/>
         </w:rPr>
-        <w:t xml:space="preserve">Adam: 😝😝😝</w:t>
+        <w:t xml:space="preserve">Kelsey: 😝😝😝</w:t>
       </w:r>
     </w:p>
     <w:p>
@@ -21813,7 +21813,7 @@
           <w:sz w:val="20"/>
           <w:szCs w:val="20"/>
         </w:rPr>
-        <w:t xml:space="preserve">Adam: Oh my gosh! 😍</w:t>
+        <w:t xml:space="preserve">Kelsey: Oh my gosh! 😍</w:t>
       </w:r>
     </w:p>
     <w:p>
@@ -21943,7 +21943,7 @@
           <w:sz w:val="20"/>
           <w:szCs w:val="20"/>
         </w:rPr>
-        <w:t xml:space="preserve">Adam: 🤪🤗</w:t>
+        <w:t xml:space="preserve">Kelsey: 🤪🤗</w:t>
       </w:r>
     </w:p>
     <w:p>
@@ -22021,7 +22021,7 @@
           <w:sz w:val="20"/>
           <w:szCs w:val="20"/>
         </w:rPr>
-        <w:t xml:space="preserve">Adam: 10/10 👏👏👏</w:t>
+        <w:t xml:space="preserve">Kelsey: 10/10 👏👏👏</w:t>
       </w:r>
     </w:p>
     <w:p>
@@ -22131,7 +22131,7 @@
           <w:sz w:val="20"/>
           <w:szCs w:val="20"/>
         </w:rPr>
-        <w:t xml:space="preserve">Adam: 😛🤗</w:t>
+        <w:t xml:space="preserve">Kelsey: 😛🤗</w:t>
       </w:r>
     </w:p>
     <w:p>
@@ -22196,7 +22196,7 @@
           <w:sz w:val="20"/>
           <w:szCs w:val="20"/>
         </w:rPr>
-        <w:t xml:space="preserve">Adam: 🤗😛🌈</w:t>
+        <w:t xml:space="preserve">Kelsey: 🤗😛🌈</w:t>
       </w:r>
     </w:p>
     <w:p>
@@ -22306,27 +22306,27 @@
           <w:sz w:val="20"/>
           <w:szCs w:val="20"/>
         </w:rPr>
-        <w:t xml:space="preserve">Adam: These are iconic Byron</w:t>
-      </w:r>
-    </w:p>
-    <w:p>
-      <w:pPr>
-        <w:pBdr>
-          <w:left w:val="single" w:color="c8a951" w:sz="12" w:space="8"/>
-        </w:pBdr>
-        <w:spacing w:after="0" w:before="60"/>
-        <w:ind w:left="360"/>
-      </w:pPr>
-      <w:r>
-        <w:rPr>
-          <w:rFonts w:ascii="Georgia" w:cs="Georgia" w:eastAsia="Georgia" w:hAnsi="Georgia"/>
-          <w:i/>
-          <w:iCs/>
-          <w:color w:val="8a6a50"/>
-          <w:sz w:val="20"/>
-          <w:szCs w:val="20"/>
-        </w:rPr>
-        <w:t xml:space="preserve">Adam: 🫰🫰🫰</w:t>
+        <w:t xml:space="preserve">Kelsey: These are iconic Byron</w:t>
+      </w:r>
+    </w:p>
+    <w:p>
+      <w:pPr>
+        <w:pBdr>
+          <w:left w:val="single" w:color="c8a951" w:sz="12" w:space="8"/>
+        </w:pBdr>
+        <w:spacing w:after="0" w:before="60"/>
+        <w:ind w:left="360"/>
+      </w:pPr>
+      <w:r>
+        <w:rPr>
+          <w:rFonts w:ascii="Georgia" w:cs="Georgia" w:eastAsia="Georgia" w:hAnsi="Georgia"/>
+          <w:i/>
+          <w:iCs/>
+          <w:color w:val="8a6a50"/>
+          <w:sz w:val="20"/>
+          <w:szCs w:val="20"/>
+        </w:rPr>
+        <w:t xml:space="preserve">Kelsey: 🫰🫰🫰</w:t>
       </w:r>
     </w:p>
     <w:p>
@@ -22391,7 +22391,7 @@
           <w:sz w:val="20"/>
           <w:szCs w:val="20"/>
         </w:rPr>
-        <w:t xml:space="preserve">Adam: 🫰🫰🫰</w:t>
+        <w:t xml:space="preserve">Kelsey: 🫰🫰🫰</w:t>
       </w:r>
     </w:p>
     <w:p>
@@ -22496,7 +22496,7 @@
           <w:sz w:val="20"/>
           <w:szCs w:val="20"/>
         </w:rPr>
-        <w:t xml:space="preserve">Adam: Reacted 😂 to an image</w:t>
+        <w:t xml:space="preserve">Kelsey: Reacted 😂 to an image</w:t>
       </w:r>
     </w:p>
     <w:p>
@@ -22581,27 +22581,27 @@
           <w:sz w:val="20"/>
           <w:szCs w:val="20"/>
         </w:rPr>
-        <w:t xml:space="preserve">Adam: Reacted 😂 to an image</w:t>
-      </w:r>
-    </w:p>
-    <w:p>
-      <w:pPr>
-        <w:pBdr>
-          <w:left w:val="single" w:color="c8a951" w:sz="12" w:space="8"/>
-        </w:pBdr>
-        <w:spacing w:after="0" w:before="60"/>
-        <w:ind w:left="360"/>
-      </w:pPr>
-      <w:r>
-        <w:rPr>
-          <w:rFonts w:ascii="Georgia" w:cs="Georgia" w:eastAsia="Georgia" w:hAnsi="Georgia"/>
-          <w:i/>
-          <w:iCs/>
-          <w:color w:val="8a6a50"/>
-          <w:sz w:val="20"/>
-          <w:szCs w:val="20"/>
-        </w:rPr>
-        <w:t xml:space="preserve">Adam: 20/10</w:t>
+        <w:t xml:space="preserve">Kelsey: Reacted 😂 to an image</w:t>
+      </w:r>
+    </w:p>
+    <w:p>
+      <w:pPr>
+        <w:pBdr>
+          <w:left w:val="single" w:color="c8a951" w:sz="12" w:space="8"/>
+        </w:pBdr>
+        <w:spacing w:after="0" w:before="60"/>
+        <w:ind w:left="360"/>
+      </w:pPr>
+      <w:r>
+        <w:rPr>
+          <w:rFonts w:ascii="Georgia" w:cs="Georgia" w:eastAsia="Georgia" w:hAnsi="Georgia"/>
+          <w:i/>
+          <w:iCs/>
+          <w:color w:val="8a6a50"/>
+          <w:sz w:val="20"/>
+          <w:szCs w:val="20"/>
+        </w:rPr>
+        <w:t xml:space="preserve">Kelsey: 20/10</w:t>
       </w:r>
     </w:p>
     <w:p>
@@ -22976,7 +22976,7 @@
           <w:sz w:val="20"/>
           <w:szCs w:val="20"/>
         </w:rPr>
-        <w:t xml:space="preserve">Adam: 😆😆😆</w:t>
+        <w:t xml:space="preserve">Kelsey: 😆😆😆</w:t>
       </w:r>
     </w:p>
     <w:p>
@@ -23041,7 +23041,7 @@
           <w:sz w:val="20"/>
           <w:szCs w:val="20"/>
         </w:rPr>
-        <w:t xml:space="preserve">Adam: 😆👏👏</w:t>
+        <w:t xml:space="preserve">Kelsey: 😆👏👏</w:t>
       </w:r>
     </w:p>
     <w:p>
@@ -23106,7 +23106,7 @@
           <w:sz w:val="20"/>
           <w:szCs w:val="20"/>
         </w:rPr>
-        <w:t xml:space="preserve">Adam: 🤣👏👏</w:t>
+        <w:t xml:space="preserve">Kelsey: 🤣👏👏</w:t>
       </w:r>
     </w:p>
     <w:p>
@@ -23327,7 +23327,7 @@
           <w:sz w:val="20"/>
           <w:szCs w:val="20"/>
         </w:rPr>
-        <w:t xml:space="preserve">Adam: 😆😆😆😆</w:t>
+        <w:t xml:space="preserve">Kelsey: 😆😆😆😆</w:t>
       </w:r>
     </w:p>
     <w:p>
@@ -23437,7 +23437,7 @@
           <w:sz w:val="20"/>
           <w:szCs w:val="20"/>
         </w:rPr>
-        <w:t xml:space="preserve">Adam: Byron! Be safe! 🤣🥲</w:t>
+        <w:t xml:space="preserve">Kelsey: Byron! Be safe! 🤣🥲</w:t>
       </w:r>
     </w:p>
     <w:p>
@@ -23637,7 +23637,7 @@
           <w:sz w:val="20"/>
           <w:szCs w:val="20"/>
         </w:rPr>
-        <w:t xml:space="preserve">Adam: Reacted ❤️ to “Della is just exhausted. She works really hard to explain to me why the addition of m</w:t>
+        <w:t xml:space="preserve">Kelsey: Reacted ❤️ to “Della is just exhausted. She works really hard to explain to me why the addition of m</w:t>
       </w:r>
     </w:p>
     <w:p>
@@ -23748,7 +23748,7 @@
           <w:sz w:val="20"/>
           <w:szCs w:val="20"/>
         </w:rPr>
-        <w:t xml:space="preserve">Adam: Lmao 😆 as someone whose vending an event in 102° heat, I feel like the walrus 🤪</w:t>
+        <w:t xml:space="preserve">Kelsey: Lmao 😆 as someone whose vending an event in 102° heat, I feel like the walrus 🤪</w:t>
       </w:r>
     </w:p>
     <w:p>
@@ -23850,7 +23850,7 @@
           <w:sz w:val="20"/>
           <w:szCs w:val="20"/>
         </w:rPr>
-        <w:t xml:space="preserve">Adam: 😆😆</w:t>
+        <w:t xml:space="preserve">Kelsey: 😆😆</w:t>
       </w:r>
     </w:p>
     <w:p>
@@ -23941,7 +23941,7 @@
           <w:sz w:val="20"/>
           <w:szCs w:val="20"/>
         </w:rPr>
-        <w:t xml:space="preserve">Adam: Oban!! 🇺🇸</w:t>
+        <w:t xml:space="preserve">Kelsey: Oban!! 🇺🇸</w:t>
       </w:r>
     </w:p>
     <w:p>
@@ -24483,7 +24483,7 @@
           <w:sz w:val="20"/>
           <w:szCs w:val="20"/>
         </w:rPr>
-        <w:t xml:space="preserve">Adam: This is a 10/10! 🪄</w:t>
+        <w:t xml:space="preserve">Kelsey: This is a 10/10! 🪄</w:t>
       </w:r>
     </w:p>
     <w:p>
@@ -24548,7 +24548,7 @@
           <w:sz w:val="20"/>
           <w:szCs w:val="20"/>
         </w:rPr>
-        <w:t xml:space="preserve">Adam: Hahaha </w:t>
+        <w:t xml:space="preserve">Kelsey: Hahaha </w:t>
       </w:r>
     </w:p>
     <w:p>
@@ -26204,7 +26204,7 @@
           <w:sz w:val="20"/>
           <w:szCs w:val="20"/>
         </w:rPr>
-        <w:t xml:space="preserve">Adam: 10/10</w:t>
+        <w:t xml:space="preserve">Kelsey: 10/10</w:t>
       </w:r>
     </w:p>
     <w:p>
@@ -26668,7 +26668,7 @@
           <w:sz w:val="20"/>
           <w:szCs w:val="20"/>
         </w:rPr>
-        <w:t xml:space="preserve">Adam: 🥰🥰</w:t>
+        <w:t xml:space="preserve">Kelsey: 🥰🥰</w:t>
       </w:r>
     </w:p>
     <w:p>
@@ -26817,7 +26817,7 @@
           <w:sz w:val="20"/>
           <w:szCs w:val="20"/>
         </w:rPr>
-        <w:t xml:space="preserve">Adam: ☺️</w:t>
+        <w:t xml:space="preserve">Kelsey: ☺️</w:t>
       </w:r>
     </w:p>
     <w:p>
@@ -26882,7 +26882,7 @@
           <w:sz w:val="20"/>
           <w:szCs w:val="20"/>
         </w:rPr>
-        <w:t xml:space="preserve">Adam: ☺️</w:t>
+        <w:t xml:space="preserve">Kelsey: ☺️</w:t>
       </w:r>
     </w:p>
     <w:p>

</xml_diff>